<commit_message>
Cleaning up code and update for Gradle 9
</commit_message>
<xml_diff>
--- a/composeApp/src/commonTest/resources/calendar.docx
+++ b/composeApp/src/commonTest/resources/calendar.docx
@@ -6,13 +6,11 @@
       <w:r>
         <w:t xml:space="preserve">January </w:t>
       </w:r>
-      <w:proofErr w:type="gramStart"/>
       <w:r>
-        <w:t>1 ,</w:t>
+        <w:t>2</w:t>
       </w:r>
-      <w:proofErr w:type="gramEnd"/>
       <w:r>
-        <w:t xml:space="preserve"> 2026</w:t>
+        <w:t xml:space="preserve"> , 2026</w:t>
       </w:r>
     </w:p>
     <w:p>

</xml_diff>